<commit_message>
Add orientation-aware dice rendering for custom sets
- New shared component: DiceFaceRenderer.tsx with getOrientedPips() engine
  computes correct pip positions for any (top, front) pair using Bible rules
- Custom sets now show visual dice previews on cards (same as presets)
- Live dice preview in custom set creation form
- Face picker disables invalid options (opposite faces greyed out)
- Auto-clears paired face if selection makes it invalid
- Fixed hydration error (button nested in button)
- Verified getOrientedPips matches all 7 preset sets
- Fixed face 3 orientation: front=6 produces ↗ not ↘ (V shape)
</commit_message>
<xml_diff>
--- a/docs/DiceIQ_Master_Checklist_v1.docx
+++ b/docs/DiceIQ_Master_Checklist_v1.docx
@@ -104,7 +104,7 @@
           <w:sz w:val="18"/>
           <w:szCs w:val="18"/>
         </w:rPr>
-        <w:t xml:space="preserve">Last Updated: March 2026  |  Version 1.0</w:t>
+        <w:t xml:space="preserve">Last Updated: March 2026  |  Version 1.1  |  Phase 2 + Phase 3A complete</w:t>
       </w:r>
     </w:p>
     <w:p>
@@ -3254,7 +3254,7 @@
               <w:bottom w:val="single" w:color="DDDDDD" w:sz="1"/>
               <w:right w:val="single" w:color="DDDDDD" w:sz="1"/>
             </w:tcBorders>
-            <w:shd w:fill="F4F6F9" w:val="clear"/>
+            <w:shd w:fill="E8F5E9" w:val="clear"/>
             <w:tcMar>
               <w:top w:type="dxa" w:w="80"/>
               <w:left w:type="dxa" w:w="120"/>
@@ -3288,28 +3288,28 @@
               <w:bottom w:val="single" w:color="DDDDDD" w:sz="1"/>
               <w:right w:val="single" w:color="DDDDDD" w:sz="1"/>
             </w:tcBorders>
-            <w:shd w:fill="FFF8E1" w:val="clear"/>
-            <w:tcMar>
-              <w:top w:type="dxa" w:w="80"/>
-              <w:left w:type="dxa" w:w="120"/>
-              <w:bottom w:type="dxa" w:w="80"/>
-              <w:right w:type="dxa" w:w="120"/>
-            </w:tcMar>
-          </w:tcPr>
-          <w:p>
-            <w:pPr>
-              <w:spacing w:after="80"/>
-            </w:pPr>
-            <w:r>
-              <w:rPr>
-                <w:rFonts w:ascii="Arial" w:cs="Arial" w:eastAsia="Arial" w:hAnsi="Arial"/>
-                <w:b/>
-                <w:bCs/>
-                <w:color w:val="B8860B"/>
-                <w:sz w:val="18"/>
-                <w:szCs w:val="18"/>
-              </w:rPr>
-              <w:t xml:space="preserve">▶  NEXT</w:t>
+            <w:shd w:fill="E8F5E9" w:val="clear"/>
+            <w:tcMar>
+              <w:top w:type="dxa" w:w="80"/>
+              <w:left w:type="dxa" w:w="120"/>
+              <w:bottom w:type="dxa" w:w="80"/>
+              <w:right w:type="dxa" w:w="120"/>
+            </w:tcMar>
+          </w:tcPr>
+          <w:p>
+            <w:pPr>
+              <w:spacing w:after="80"/>
+            </w:pPr>
+            <w:r>
+              <w:rPr>
+                <w:rFonts w:ascii="Arial" w:cs="Arial" w:eastAsia="Arial" w:hAnsi="Arial"/>
+                <w:b/>
+                <w:bCs/>
+                <w:color w:val="1A7A4A"/>
+                <w:sz w:val="18"/>
+                <w:szCs w:val="18"/>
+              </w:rPr>
+              <w:t xml:space="preserve">✓  DONE</w:t>
             </w:r>
           </w:p>
         </w:tc>
@@ -3391,7 +3391,7 @@
               <w:bottom w:val="single" w:color="DDDDDD" w:sz="1"/>
               <w:right w:val="single" w:color="DDDDDD" w:sz="1"/>
             </w:tcBorders>
-            <w:shd w:fill="F4F6F9" w:val="clear"/>
+            <w:shd w:fill="E8F5E9" w:val="clear"/>
             <w:tcMar>
               <w:top w:type="dxa" w:w="80"/>
               <w:left w:type="dxa" w:w="120"/>
@@ -3425,7 +3425,7 @@
               <w:bottom w:val="single" w:color="DDDDDD" w:sz="1"/>
               <w:right w:val="single" w:color="DDDDDD" w:sz="1"/>
             </w:tcBorders>
-            <w:shd w:fill="F4F6F9" w:val="clear"/>
+            <w:shd w:fill="E8F5E9" w:val="clear"/>
             <w:tcMar>
               <w:top w:type="dxa" w:w="80"/>
               <w:left w:type="dxa" w:w="120"/>
@@ -3446,7 +3446,7 @@
                 <w:sz w:val="18"/>
                 <w:szCs w:val="18"/>
               </w:rPr>
-              <w:t xml:space="preserve">○  PENDING</w:t>
+              <w:t xml:space="preserve">✓  DONE</w:t>
             </w:r>
           </w:p>
         </w:tc>
@@ -3528,7 +3528,7 @@
               <w:bottom w:val="single" w:color="DDDDDD" w:sz="1"/>
               <w:right w:val="single" w:color="DDDDDD" w:sz="1"/>
             </w:tcBorders>
-            <w:shd w:fill="F4F6F9" w:val="clear"/>
+            <w:shd w:fill="E8F5E9" w:val="clear"/>
             <w:tcMar>
               <w:top w:type="dxa" w:w="80"/>
               <w:left w:type="dxa" w:w="120"/>
@@ -3562,7 +3562,7 @@
               <w:bottom w:val="single" w:color="DDDDDD" w:sz="1"/>
               <w:right w:val="single" w:color="DDDDDD" w:sz="1"/>
             </w:tcBorders>
-            <w:shd w:fill="F4F6F9" w:val="clear"/>
+            <w:shd w:fill="E8F5E9" w:val="clear"/>
             <w:tcMar>
               <w:top w:type="dxa" w:w="80"/>
               <w:left w:type="dxa" w:w="120"/>
@@ -3583,7 +3583,7 @@
                 <w:sz w:val="18"/>
                 <w:szCs w:val="18"/>
               </w:rPr>
-              <w:t xml:space="preserve">○  PENDING</w:t>
+              <w:t xml:space="preserve">✓  DONE</w:t>
             </w:r>
           </w:p>
         </w:tc>
@@ -3665,7 +3665,7 @@
               <w:bottom w:val="single" w:color="DDDDDD" w:sz="1"/>
               <w:right w:val="single" w:color="DDDDDD" w:sz="1"/>
             </w:tcBorders>
-            <w:shd w:fill="F4F6F9" w:val="clear"/>
+            <w:shd w:fill="E8F5E9" w:val="clear"/>
             <w:tcMar>
               <w:top w:type="dxa" w:w="80"/>
               <w:left w:type="dxa" w:w="120"/>
@@ -3699,7 +3699,7 @@
               <w:bottom w:val="single" w:color="DDDDDD" w:sz="1"/>
               <w:right w:val="single" w:color="DDDDDD" w:sz="1"/>
             </w:tcBorders>
-            <w:shd w:fill="F4F6F9" w:val="clear"/>
+            <w:shd w:fill="E8F5E9" w:val="clear"/>
             <w:tcMar>
               <w:top w:type="dxa" w:w="80"/>
               <w:left w:type="dxa" w:w="120"/>
@@ -3720,7 +3720,7 @@
                 <w:sz w:val="18"/>
                 <w:szCs w:val="18"/>
               </w:rPr>
-              <w:t xml:space="preserve">○  PENDING</w:t>
+              <w:t xml:space="preserve">✓  DONE</w:t>
             </w:r>
           </w:p>
         </w:tc>
@@ -3802,7 +3802,7 @@
               <w:bottom w:val="single" w:color="DDDDDD" w:sz="1"/>
               <w:right w:val="single" w:color="DDDDDD" w:sz="1"/>
             </w:tcBorders>
-            <w:shd w:fill="F4F6F9" w:val="clear"/>
+            <w:shd w:fill="E8F5E9" w:val="clear"/>
             <w:tcMar>
               <w:top w:type="dxa" w:w="80"/>
               <w:left w:type="dxa" w:w="120"/>
@@ -3836,7 +3836,7 @@
               <w:bottom w:val="single" w:color="DDDDDD" w:sz="1"/>
               <w:right w:val="single" w:color="DDDDDD" w:sz="1"/>
             </w:tcBorders>
-            <w:shd w:fill="F4F6F9" w:val="clear"/>
+            <w:shd w:fill="E8F5E9" w:val="clear"/>
             <w:tcMar>
               <w:top w:type="dxa" w:w="80"/>
               <w:left w:type="dxa" w:w="120"/>
@@ -3857,7 +3857,7 @@
                 <w:sz w:val="18"/>
                 <w:szCs w:val="18"/>
               </w:rPr>
-              <w:t xml:space="preserve">○  PENDING</w:t>
+              <w:t xml:space="preserve">✓  DONE</w:t>
             </w:r>
           </w:p>
         </w:tc>
@@ -3976,7 +3976,7 @@
               <w:bottom w:val="single" w:color="DDDDDD" w:sz="1"/>
               <w:right w:val="single" w:color="DDDDDD" w:sz="1"/>
             </w:tcBorders>
-            <w:shd w:fill="F4F6F9" w:val="clear"/>
+            <w:shd w:fill="E8F5E9" w:val="clear"/>
             <w:tcMar>
               <w:top w:type="dxa" w:w="80"/>
               <w:left w:type="dxa" w:w="120"/>
@@ -4010,7 +4010,7 @@
               <w:bottom w:val="single" w:color="DDDDDD" w:sz="1"/>
               <w:right w:val="single" w:color="DDDDDD" w:sz="1"/>
             </w:tcBorders>
-            <w:shd w:fill="F4F6F9" w:val="clear"/>
+            <w:shd w:fill="E8F5E9" w:val="clear"/>
             <w:tcMar>
               <w:top w:type="dxa" w:w="80"/>
               <w:left w:type="dxa" w:w="120"/>
@@ -4031,7 +4031,7 @@
                 <w:sz w:val="18"/>
                 <w:szCs w:val="18"/>
               </w:rPr>
-              <w:t xml:space="preserve">○  PENDING</w:t>
+              <w:t xml:space="preserve">✓  DONE</w:t>
             </w:r>
           </w:p>
         </w:tc>
@@ -4113,7 +4113,7 @@
               <w:bottom w:val="single" w:color="DDDDDD" w:sz="1"/>
               <w:right w:val="single" w:color="DDDDDD" w:sz="1"/>
             </w:tcBorders>
-            <w:shd w:fill="F4F6F9" w:val="clear"/>
+            <w:shd w:fill="E8F5E9" w:val="clear"/>
             <w:tcMar>
               <w:top w:type="dxa" w:w="80"/>
               <w:left w:type="dxa" w:w="120"/>
@@ -4147,7 +4147,7 @@
               <w:bottom w:val="single" w:color="DDDDDD" w:sz="1"/>
               <w:right w:val="single" w:color="DDDDDD" w:sz="1"/>
             </w:tcBorders>
-            <w:shd w:fill="F4F6F9" w:val="clear"/>
+            <w:shd w:fill="E8F5E9" w:val="clear"/>
             <w:tcMar>
               <w:top w:type="dxa" w:w="80"/>
               <w:left w:type="dxa" w:w="120"/>
@@ -4168,7 +4168,7 @@
                 <w:sz w:val="18"/>
                 <w:szCs w:val="18"/>
               </w:rPr>
-              <w:t xml:space="preserve">○  PENDING</w:t>
+              <w:t xml:space="preserve">✓  DONE</w:t>
             </w:r>
           </w:p>
         </w:tc>
@@ -4250,7 +4250,7 @@
               <w:bottom w:val="single" w:color="DDDDDD" w:sz="1"/>
               <w:right w:val="single" w:color="DDDDDD" w:sz="1"/>
             </w:tcBorders>
-            <w:shd w:fill="F4F6F9" w:val="clear"/>
+            <w:shd w:fill="E8F5E9" w:val="clear"/>
             <w:tcMar>
               <w:top w:type="dxa" w:w="80"/>
               <w:left w:type="dxa" w:w="120"/>
@@ -4284,7 +4284,7 @@
               <w:bottom w:val="single" w:color="DDDDDD" w:sz="1"/>
               <w:right w:val="single" w:color="DDDDDD" w:sz="1"/>
             </w:tcBorders>
-            <w:shd w:fill="F4F6F9" w:val="clear"/>
+            <w:shd w:fill="E8F5E9" w:val="clear"/>
             <w:tcMar>
               <w:top w:type="dxa" w:w="80"/>
               <w:left w:type="dxa" w:w="120"/>
@@ -4305,7 +4305,7 @@
                 <w:sz w:val="18"/>
                 <w:szCs w:val="18"/>
               </w:rPr>
-              <w:t xml:space="preserve">○  PENDING</w:t>
+              <w:t xml:space="preserve">✓  DONE</w:t>
             </w:r>
           </w:p>
         </w:tc>
@@ -4387,7 +4387,7 @@
               <w:bottom w:val="single" w:color="DDDDDD" w:sz="1"/>
               <w:right w:val="single" w:color="DDDDDD" w:sz="1"/>
             </w:tcBorders>
-            <w:shd w:fill="F4F6F9" w:val="clear"/>
+            <w:shd w:fill="E8F5E9" w:val="clear"/>
             <w:tcMar>
               <w:top w:type="dxa" w:w="80"/>
               <w:left w:type="dxa" w:w="120"/>
@@ -4421,7 +4421,7 @@
               <w:bottom w:val="single" w:color="DDDDDD" w:sz="1"/>
               <w:right w:val="single" w:color="DDDDDD" w:sz="1"/>
             </w:tcBorders>
-            <w:shd w:fill="F4F6F9" w:val="clear"/>
+            <w:shd w:fill="E8F5E9" w:val="clear"/>
             <w:tcMar>
               <w:top w:type="dxa" w:w="80"/>
               <w:left w:type="dxa" w:w="120"/>
@@ -4442,7 +4442,7 @@
                 <w:sz w:val="18"/>
                 <w:szCs w:val="18"/>
               </w:rPr>
-              <w:t xml:space="preserve">○  PENDING</w:t>
+              <w:t xml:space="preserve">✓  DONE</w:t>
             </w:r>
           </w:p>
         </w:tc>
@@ -4561,7 +4561,7 @@
               <w:bottom w:val="single" w:color="DDDDDD" w:sz="1"/>
               <w:right w:val="single" w:color="DDDDDD" w:sz="1"/>
             </w:tcBorders>
-            <w:shd w:fill="F4F6F9" w:val="clear"/>
+            <w:shd w:fill="E8F5E9" w:val="clear"/>
             <w:tcMar>
               <w:top w:type="dxa" w:w="80"/>
               <w:left w:type="dxa" w:w="120"/>
@@ -4595,7 +4595,7 @@
               <w:bottom w:val="single" w:color="DDDDDD" w:sz="1"/>
               <w:right w:val="single" w:color="DDDDDD" w:sz="1"/>
             </w:tcBorders>
-            <w:shd w:fill="F4F6F9" w:val="clear"/>
+            <w:shd w:fill="E8F5E9" w:val="clear"/>
             <w:tcMar>
               <w:top w:type="dxa" w:w="80"/>
               <w:left w:type="dxa" w:w="120"/>
@@ -4616,7 +4616,7 @@
                 <w:sz w:val="18"/>
                 <w:szCs w:val="18"/>
               </w:rPr>
-              <w:t xml:space="preserve">○  PENDING</w:t>
+              <w:t xml:space="preserve">✓  DONE</w:t>
             </w:r>
           </w:p>
         </w:tc>
@@ -4698,7 +4698,7 @@
               <w:bottom w:val="single" w:color="DDDDDD" w:sz="1"/>
               <w:right w:val="single" w:color="DDDDDD" w:sz="1"/>
             </w:tcBorders>
-            <w:shd w:fill="F4F6F9" w:val="clear"/>
+            <w:shd w:fill="E8F5E9" w:val="clear"/>
             <w:tcMar>
               <w:top w:type="dxa" w:w="80"/>
               <w:left w:type="dxa" w:w="120"/>
@@ -4732,7 +4732,7 @@
               <w:bottom w:val="single" w:color="DDDDDD" w:sz="1"/>
               <w:right w:val="single" w:color="DDDDDD" w:sz="1"/>
             </w:tcBorders>
-            <w:shd w:fill="F4F6F9" w:val="clear"/>
+            <w:shd w:fill="E8F5E9" w:val="clear"/>
             <w:tcMar>
               <w:top w:type="dxa" w:w="80"/>
               <w:left w:type="dxa" w:w="120"/>
@@ -4753,7 +4753,7 @@
                 <w:sz w:val="18"/>
                 <w:szCs w:val="18"/>
               </w:rPr>
-              <w:t xml:space="preserve">○  PENDING</w:t>
+              <w:t xml:space="preserve">✓  DONE</w:t>
             </w:r>
           </w:p>
         </w:tc>
@@ -4835,7 +4835,7 @@
               <w:bottom w:val="single" w:color="DDDDDD" w:sz="1"/>
               <w:right w:val="single" w:color="DDDDDD" w:sz="1"/>
             </w:tcBorders>
-            <w:shd w:fill="F4F6F9" w:val="clear"/>
+            <w:shd w:fill="E8F5E9" w:val="clear"/>
             <w:tcMar>
               <w:top w:type="dxa" w:w="80"/>
               <w:left w:type="dxa" w:w="120"/>
@@ -4869,7 +4869,7 @@
               <w:bottom w:val="single" w:color="DDDDDD" w:sz="1"/>
               <w:right w:val="single" w:color="DDDDDD" w:sz="1"/>
             </w:tcBorders>
-            <w:shd w:fill="F4F6F9" w:val="clear"/>
+            <w:shd w:fill="E8F5E9" w:val="clear"/>
             <w:tcMar>
               <w:top w:type="dxa" w:w="80"/>
               <w:left w:type="dxa" w:w="120"/>
@@ -4890,7 +4890,7 @@
                 <w:sz w:val="18"/>
                 <w:szCs w:val="18"/>
               </w:rPr>
-              <w:t xml:space="preserve">○  PENDING</w:t>
+              <w:t xml:space="preserve">✓  DONE</w:t>
             </w:r>
           </w:p>
         </w:tc>
@@ -5009,7 +5009,7 @@
               <w:bottom w:val="single" w:color="DDDDDD" w:sz="1"/>
               <w:right w:val="single" w:color="DDDDDD" w:sz="1"/>
             </w:tcBorders>
-            <w:shd w:fill="F4F6F9" w:val="clear"/>
+            <w:shd w:fill="E8F5E9" w:val="clear"/>
             <w:tcMar>
               <w:top w:type="dxa" w:w="80"/>
               <w:left w:type="dxa" w:w="120"/>
@@ -5043,7 +5043,7 @@
               <w:bottom w:val="single" w:color="DDDDDD" w:sz="1"/>
               <w:right w:val="single" w:color="DDDDDD" w:sz="1"/>
             </w:tcBorders>
-            <w:shd w:fill="F4F6F9" w:val="clear"/>
+            <w:shd w:fill="E8F5E9" w:val="clear"/>
             <w:tcMar>
               <w:top w:type="dxa" w:w="80"/>
               <w:left w:type="dxa" w:w="120"/>
@@ -5064,7 +5064,7 @@
                 <w:sz w:val="18"/>
                 <w:szCs w:val="18"/>
               </w:rPr>
-              <w:t xml:space="preserve">○  PENDING</w:t>
+              <w:t xml:space="preserve">✓  DONE</w:t>
             </w:r>
           </w:p>
         </w:tc>
@@ -5146,7 +5146,7 @@
               <w:bottom w:val="single" w:color="DDDDDD" w:sz="1"/>
               <w:right w:val="single" w:color="DDDDDD" w:sz="1"/>
             </w:tcBorders>
-            <w:shd w:fill="F4F6F9" w:val="clear"/>
+            <w:shd w:fill="E8F5E9" w:val="clear"/>
             <w:tcMar>
               <w:top w:type="dxa" w:w="80"/>
               <w:left w:type="dxa" w:w="120"/>
@@ -5180,7 +5180,7 @@
               <w:bottom w:val="single" w:color="DDDDDD" w:sz="1"/>
               <w:right w:val="single" w:color="DDDDDD" w:sz="1"/>
             </w:tcBorders>
-            <w:shd w:fill="F4F6F9" w:val="clear"/>
+            <w:shd w:fill="E8F5E9" w:val="clear"/>
             <w:tcMar>
               <w:top w:type="dxa" w:w="80"/>
               <w:left w:type="dxa" w:w="120"/>
@@ -5201,7 +5201,7 @@
                 <w:sz w:val="18"/>
                 <w:szCs w:val="18"/>
               </w:rPr>
-              <w:t xml:space="preserve">○  PENDING</w:t>
+              <w:t xml:space="preserve">✓  DONE</w:t>
             </w:r>
           </w:p>
         </w:tc>
@@ -5283,7 +5283,7 @@
               <w:bottom w:val="single" w:color="DDDDDD" w:sz="1"/>
               <w:right w:val="single" w:color="DDDDDD" w:sz="1"/>
             </w:tcBorders>
-            <w:shd w:fill="F4F6F9" w:val="clear"/>
+            <w:shd w:fill="E8F5E9" w:val="clear"/>
             <w:tcMar>
               <w:top w:type="dxa" w:w="80"/>
               <w:left w:type="dxa" w:w="120"/>
@@ -5317,7 +5317,7 @@
               <w:bottom w:val="single" w:color="DDDDDD" w:sz="1"/>
               <w:right w:val="single" w:color="DDDDDD" w:sz="1"/>
             </w:tcBorders>
-            <w:shd w:fill="F4F6F9" w:val="clear"/>
+            <w:shd w:fill="E8F5E9" w:val="clear"/>
             <w:tcMar>
               <w:top w:type="dxa" w:w="80"/>
               <w:left w:type="dxa" w:w="120"/>
@@ -5338,7 +5338,7 @@
                 <w:sz w:val="18"/>
                 <w:szCs w:val="18"/>
               </w:rPr>
-              <w:t xml:space="preserve">○  PENDING</w:t>
+              <w:t xml:space="preserve">✓  DONE</w:t>
             </w:r>
           </w:p>
         </w:tc>
@@ -5420,7 +5420,7 @@
               <w:bottom w:val="single" w:color="DDDDDD" w:sz="1"/>
               <w:right w:val="single" w:color="DDDDDD" w:sz="1"/>
             </w:tcBorders>
-            <w:shd w:fill="F4F6F9" w:val="clear"/>
+            <w:shd w:fill="E8F5E9" w:val="clear"/>
             <w:tcMar>
               <w:top w:type="dxa" w:w="80"/>
               <w:left w:type="dxa" w:w="120"/>
@@ -5454,7 +5454,7 @@
               <w:bottom w:val="single" w:color="DDDDDD" w:sz="1"/>
               <w:right w:val="single" w:color="DDDDDD" w:sz="1"/>
             </w:tcBorders>
-            <w:shd w:fill="F4F6F9" w:val="clear"/>
+            <w:shd w:fill="E8F5E9" w:val="clear"/>
             <w:tcMar>
               <w:top w:type="dxa" w:w="80"/>
               <w:left w:type="dxa" w:w="120"/>
@@ -5475,7 +5475,7 @@
                 <w:sz w:val="18"/>
                 <w:szCs w:val="18"/>
               </w:rPr>
-              <w:t xml:space="preserve">○  PENDING</w:t>
+              <w:t xml:space="preserve">✓  DONE</w:t>
             </w:r>
           </w:p>
         </w:tc>
@@ -5778,7 +5778,7 @@
               <w:bottom w:val="single" w:color="DDDDDD" w:sz="1"/>
               <w:right w:val="single" w:color="DDDDDD" w:sz="1"/>
             </w:tcBorders>
-            <w:shd w:fill="F4F6F9" w:val="clear"/>
+            <w:shd w:fill="E8F5E9" w:val="clear"/>
             <w:tcMar>
               <w:top w:type="dxa" w:w="80"/>
               <w:left w:type="dxa" w:w="120"/>
@@ -5812,7 +5812,7 @@
               <w:bottom w:val="single" w:color="DDDDDD" w:sz="1"/>
               <w:right w:val="single" w:color="DDDDDD" w:sz="1"/>
             </w:tcBorders>
-            <w:shd w:fill="F4F6F9" w:val="clear"/>
+            <w:shd w:fill="E8F5E9" w:val="clear"/>
             <w:tcMar>
               <w:top w:type="dxa" w:w="80"/>
               <w:left w:type="dxa" w:w="120"/>
@@ -5833,7 +5833,7 @@
                 <w:sz w:val="18"/>
                 <w:szCs w:val="18"/>
               </w:rPr>
-              <w:t xml:space="preserve">○  PENDING</w:t>
+              <w:t xml:space="preserve">✓  DONE</w:t>
             </w:r>
           </w:p>
         </w:tc>
@@ -5915,7 +5915,7 @@
               <w:bottom w:val="single" w:color="DDDDDD" w:sz="1"/>
               <w:right w:val="single" w:color="DDDDDD" w:sz="1"/>
             </w:tcBorders>
-            <w:shd w:fill="F4F6F9" w:val="clear"/>
+            <w:shd w:fill="E8F5E9" w:val="clear"/>
             <w:tcMar>
               <w:top w:type="dxa" w:w="80"/>
               <w:left w:type="dxa" w:w="120"/>
@@ -5949,7 +5949,7 @@
               <w:bottom w:val="single" w:color="DDDDDD" w:sz="1"/>
               <w:right w:val="single" w:color="DDDDDD" w:sz="1"/>
             </w:tcBorders>
-            <w:shd w:fill="F4F6F9" w:val="clear"/>
+            <w:shd w:fill="E8F5E9" w:val="clear"/>
             <w:tcMar>
               <w:top w:type="dxa" w:w="80"/>
               <w:left w:type="dxa" w:w="120"/>
@@ -5970,7 +5970,7 @@
                 <w:sz w:val="18"/>
                 <w:szCs w:val="18"/>
               </w:rPr>
-              <w:t xml:space="preserve">○  PENDING</w:t>
+              <w:t xml:space="preserve">✓  DONE</w:t>
             </w:r>
           </w:p>
         </w:tc>
@@ -6052,7 +6052,7 @@
               <w:bottom w:val="single" w:color="DDDDDD" w:sz="1"/>
               <w:right w:val="single" w:color="DDDDDD" w:sz="1"/>
             </w:tcBorders>
-            <w:shd w:fill="F4F6F9" w:val="clear"/>
+            <w:shd w:fill="E8F5E9" w:val="clear"/>
             <w:tcMar>
               <w:top w:type="dxa" w:w="80"/>
               <w:left w:type="dxa" w:w="120"/>
@@ -6086,7 +6086,7 @@
               <w:bottom w:val="single" w:color="DDDDDD" w:sz="1"/>
               <w:right w:val="single" w:color="DDDDDD" w:sz="1"/>
             </w:tcBorders>
-            <w:shd w:fill="F4F6F9" w:val="clear"/>
+            <w:shd w:fill="E8F5E9" w:val="clear"/>
             <w:tcMar>
               <w:top w:type="dxa" w:w="80"/>
               <w:left w:type="dxa" w:w="120"/>
@@ -6107,7 +6107,7 @@
                 <w:sz w:val="18"/>
                 <w:szCs w:val="18"/>
               </w:rPr>
-              <w:t xml:space="preserve">○  PENDING</w:t>
+              <w:t xml:space="preserve">✓  DONE</w:t>
             </w:r>
           </w:p>
         </w:tc>

</xml_diff>